<commit_message>
adding Scott et al
</commit_message>
<xml_diff>
--- a/static/CV_UPDATED.docx
+++ b/static/CV_UPDATED.docx
@@ -3956,25 +3956,7 @@
                 <w:sz w:val="20"/>
                 <w:szCs w:val="20"/>
               </w:rPr>
-              <w:t xml:space="preserve"> Graduate Assistant at the </w:t>
-            </w:r>
-            <w:proofErr w:type="spellStart"/>
-            <w:r>
-              <w:rPr>
-                <w:rFonts w:cstheme="minorHAnsi"/>
-                <w:sz w:val="20"/>
-                <w:szCs w:val="20"/>
-              </w:rPr>
-              <w:t>Koobi</w:t>
-            </w:r>
-            <w:proofErr w:type="spellEnd"/>
-            <w:r>
-              <w:rPr>
-                <w:rFonts w:cstheme="minorHAnsi"/>
-                <w:sz w:val="20"/>
-                <w:szCs w:val="20"/>
-              </w:rPr>
-              <w:t xml:space="preserve"> Fora Field School (</w:t>
+              <w:t xml:space="preserve"> Graduate Assistant at the Koobi Fora Field School (</w:t>
             </w:r>
             <w:r>
               <w:rPr>
@@ -3990,25 +3972,7 @@
                 <w:sz w:val="20"/>
                 <w:szCs w:val="20"/>
               </w:rPr>
-              <w:t xml:space="preserve">); member of the Paleoecology research group at </w:t>
-            </w:r>
-            <w:proofErr w:type="spellStart"/>
-            <w:r>
-              <w:rPr>
-                <w:rFonts w:cstheme="minorHAnsi"/>
-                <w:sz w:val="20"/>
-                <w:szCs w:val="20"/>
-              </w:rPr>
-              <w:t>Koobi</w:t>
-            </w:r>
-            <w:proofErr w:type="spellEnd"/>
-            <w:r>
-              <w:rPr>
-                <w:rFonts w:cstheme="minorHAnsi"/>
-                <w:sz w:val="20"/>
-                <w:szCs w:val="20"/>
-              </w:rPr>
-              <w:t xml:space="preserve"> Fora.</w:t>
+              <w:t>); member of the Paleoecology research group at Koobi Fora.</w:t>
             </w:r>
           </w:p>
         </w:tc>
@@ -5193,22 +5157,15 @@
           <w:szCs w:val="20"/>
         </w:rPr>
       </w:pPr>
-      <w:r>
-        <w:rPr>
-          <w:rFonts w:cstheme="minorHAnsi"/>
-          <w:sz w:val="20"/>
-          <w:szCs w:val="20"/>
-        </w:rPr>
-        <w:t xml:space="preserve">Biro D, </w:t>
-      </w:r>
       <w:proofErr w:type="spellStart"/>
       <w:r>
         <w:rPr>
           <w:rFonts w:cstheme="minorHAnsi"/>
           <w:sz w:val="20"/>
           <w:szCs w:val="20"/>
-        </w:rPr>
-        <w:t>Muschinski</w:t>
+          <w:lang w:val="pt-PT"/>
+        </w:rPr>
+        <w:t>Farassi</w:t>
       </w:r>
       <w:proofErr w:type="spellEnd"/>
       <w:r>
@@ -5216,8 +5173,9 @@
           <w:rFonts w:cstheme="minorHAnsi"/>
           <w:sz w:val="20"/>
           <w:szCs w:val="20"/>
-        </w:rPr>
-        <w:t xml:space="preserve"> J, Hammond P, Bobe R, Bamford M, Capelli C, </w:t>
+          <w:lang w:val="pt-PT"/>
+        </w:rPr>
+        <w:t xml:space="preserve"> R, </w:t>
       </w:r>
       <w:r>
         <w:rPr>
@@ -5226,6 +5184,7 @@
           <w:bCs/>
           <w:sz w:val="20"/>
           <w:szCs w:val="20"/>
+          <w:lang w:val="pt-PT"/>
         </w:rPr>
         <w:t>d’Oliveira Coelho J</w:t>
       </w:r>
@@ -5234,150 +5193,17 @@
           <w:rFonts w:cstheme="minorHAnsi"/>
           <w:sz w:val="20"/>
           <w:szCs w:val="20"/>
-        </w:rPr>
-        <w:t xml:space="preserve">, </w:t>
-      </w:r>
-      <w:proofErr w:type="spellStart"/>
-      <w:r>
-        <w:rPr>
-          <w:rFonts w:cstheme="minorHAnsi"/>
-          <w:sz w:val="20"/>
-          <w:szCs w:val="20"/>
-        </w:rPr>
-        <w:t>Farassi</w:t>
-      </w:r>
-      <w:proofErr w:type="spellEnd"/>
-      <w:r>
-        <w:rPr>
-          <w:rFonts w:cstheme="minorHAnsi"/>
-          <w:sz w:val="20"/>
-          <w:szCs w:val="20"/>
-        </w:rPr>
-        <w:t xml:space="preserve"> R, </w:t>
-      </w:r>
-      <w:proofErr w:type="spellStart"/>
-      <w:r>
-        <w:rPr>
-          <w:rFonts w:cstheme="minorHAnsi"/>
-          <w:sz w:val="20"/>
-          <w:szCs w:val="20"/>
-        </w:rPr>
-        <w:t>Lüdecke</w:t>
-      </w:r>
-      <w:proofErr w:type="spellEnd"/>
-      <w:r>
-        <w:rPr>
-          <w:rFonts w:cstheme="minorHAnsi"/>
-          <w:sz w:val="20"/>
-          <w:szCs w:val="20"/>
-        </w:rPr>
-        <w:t xml:space="preserve"> T, Martinez F, Mathe J, Ferreira da Silva MJ, Carvalho S. 2025. West </w:t>
-      </w:r>
-      <w:r>
-        <w:rPr>
-          <w:rFonts w:cstheme="minorHAnsi"/>
-          <w:sz w:val="20"/>
-          <w:szCs w:val="20"/>
-        </w:rPr>
-        <w:t>S</w:t>
-      </w:r>
-      <w:r>
-        <w:rPr>
-          <w:rFonts w:cstheme="minorHAnsi"/>
-          <w:sz w:val="20"/>
-          <w:szCs w:val="20"/>
-        </w:rPr>
-        <w:t xml:space="preserve">ide </w:t>
-      </w:r>
-      <w:r>
-        <w:rPr>
-          <w:rFonts w:cstheme="minorHAnsi"/>
-          <w:sz w:val="20"/>
-          <w:szCs w:val="20"/>
-        </w:rPr>
-        <w:t>S</w:t>
-      </w:r>
-      <w:r>
-        <w:rPr>
-          <w:rFonts w:cstheme="minorHAnsi"/>
-          <w:sz w:val="20"/>
-          <w:szCs w:val="20"/>
-        </w:rPr>
-        <w:t xml:space="preserve">tory: Regional inter-troop variation in baboon bark-stripping at </w:t>
-      </w:r>
-      <w:proofErr w:type="spellStart"/>
-      <w:r>
-        <w:rPr>
-          <w:rFonts w:cstheme="minorHAnsi"/>
-          <w:sz w:val="20"/>
-          <w:szCs w:val="20"/>
-        </w:rPr>
-        <w:t>G</w:t>
-      </w:r>
-      <w:r>
-        <w:rPr>
-          <w:rFonts w:cstheme="minorHAnsi"/>
-          <w:sz w:val="20"/>
-          <w:szCs w:val="20"/>
-        </w:rPr>
-        <w:t>orongosa</w:t>
-      </w:r>
-      <w:proofErr w:type="spellEnd"/>
-      <w:r>
-        <w:rPr>
-          <w:rFonts w:cstheme="minorHAnsi"/>
-          <w:sz w:val="20"/>
-          <w:szCs w:val="20"/>
-        </w:rPr>
-        <w:t xml:space="preserve"> </w:t>
-      </w:r>
-      <w:r>
-        <w:rPr>
-          <w:rFonts w:cstheme="minorHAnsi"/>
-          <w:sz w:val="20"/>
-          <w:szCs w:val="20"/>
-        </w:rPr>
-        <w:t>N</w:t>
-      </w:r>
-      <w:r>
-        <w:rPr>
-          <w:rFonts w:cstheme="minorHAnsi"/>
-          <w:sz w:val="20"/>
-          <w:szCs w:val="20"/>
-        </w:rPr>
-        <w:t xml:space="preserve">ational </w:t>
-      </w:r>
-      <w:r>
-        <w:rPr>
-          <w:rFonts w:cstheme="minorHAnsi"/>
-          <w:sz w:val="20"/>
-          <w:szCs w:val="20"/>
-        </w:rPr>
-        <w:t>P</w:t>
-      </w:r>
-      <w:r>
-        <w:rPr>
-          <w:rFonts w:cstheme="minorHAnsi"/>
-          <w:sz w:val="20"/>
-          <w:szCs w:val="20"/>
-        </w:rPr>
-        <w:t xml:space="preserve">ark, </w:t>
-      </w:r>
-      <w:r>
-        <w:rPr>
-          <w:rFonts w:cstheme="minorHAnsi"/>
-          <w:sz w:val="20"/>
-          <w:szCs w:val="20"/>
-        </w:rPr>
-        <w:t>M</w:t>
-      </w:r>
-      <w:r>
-        <w:rPr>
-          <w:rFonts w:cstheme="minorHAnsi"/>
-          <w:sz w:val="20"/>
-          <w:szCs w:val="20"/>
-        </w:rPr>
-        <w:t xml:space="preserve">ozambique. </w:t>
+          <w:lang w:val="pt-PT"/>
+        </w:rPr>
+        <w:t xml:space="preserve">, Carvalho S. 2025. </w:t>
+      </w:r>
+      <w:r>
+        <w:rPr>
+          <w:rFonts w:cstheme="minorHAnsi"/>
+          <w:sz w:val="20"/>
+          <w:szCs w:val="20"/>
+        </w:rPr>
+        <w:t xml:space="preserve">Habitat use and the demographics of object manipulation by wild chacma baboons. </w:t>
       </w:r>
       <w:r>
         <w:rPr>
@@ -5395,7 +5221,41 @@
           <w:sz w:val="20"/>
           <w:szCs w:val="20"/>
         </w:rPr>
-        <w:t xml:space="preserve"> (Accepted).</w:t>
+        <w:t xml:space="preserve">, </w:t>
+      </w:r>
+      <w:proofErr w:type="gramStart"/>
+      <w:r>
+        <w:rPr>
+          <w:rFonts w:cstheme="minorHAnsi"/>
+          <w:sz w:val="20"/>
+          <w:szCs w:val="20"/>
+        </w:rPr>
+        <w:t>187:e</w:t>
+      </w:r>
+      <w:proofErr w:type="gramEnd"/>
+      <w:r>
+        <w:rPr>
+          <w:rFonts w:cstheme="minorHAnsi"/>
+          <w:sz w:val="20"/>
+          <w:szCs w:val="20"/>
+        </w:rPr>
+        <w:t>70094.</w:t>
+      </w:r>
+      <w:r>
+        <w:rPr>
+          <w:rFonts w:cstheme="minorHAnsi"/>
+          <w:sz w:val="20"/>
+          <w:szCs w:val="20"/>
+        </w:rPr>
+        <w:t xml:space="preserve"> DOI: </w:t>
+      </w:r>
+      <w:r>
+        <w:rPr>
+          <w:rFonts w:cstheme="minorHAnsi"/>
+          <w:sz w:val="20"/>
+          <w:szCs w:val="20"/>
+        </w:rPr>
+        <w:t>10.1002/ajpa.70094</w:t>
       </w:r>
     </w:p>
     <w:p>
@@ -5415,7 +5275,7 @@
           <w:sz w:val="20"/>
           <w:szCs w:val="20"/>
         </w:rPr>
-        <w:t xml:space="preserve">Regala FT, Pinto MJ, Paulo LM, Bobe R, Raja M, Aldeias V, Archer W, Braun DR, </w:t>
+        <w:t xml:space="preserve">Biro D, </w:t>
       </w:r>
       <w:proofErr w:type="spellStart"/>
       <w:r>
@@ -5424,7 +5284,7 @@
           <w:sz w:val="20"/>
           <w:szCs w:val="20"/>
         </w:rPr>
-        <w:t>Lüdecke</w:t>
+        <w:t>Muschinski</w:t>
       </w:r>
       <w:proofErr w:type="spellEnd"/>
       <w:r>
@@ -5433,7 +5293,7 @@
           <w:sz w:val="20"/>
           <w:szCs w:val="20"/>
         </w:rPr>
-        <w:t xml:space="preserve"> T, </w:t>
+        <w:t xml:space="preserve"> J, Hammond P, Bobe R, Bamford M, Capelli C, </w:t>
       </w:r>
       <w:r>
         <w:rPr>
@@ -5451,7 +5311,7 @@
           <w:sz w:val="20"/>
           <w:szCs w:val="20"/>
         </w:rPr>
-        <w:t xml:space="preserve">, Mathe J, </w:t>
+        <w:t xml:space="preserve">, </w:t>
       </w:r>
       <w:proofErr w:type="spellStart"/>
       <w:r>
@@ -5460,7 +5320,7 @@
           <w:sz w:val="20"/>
           <w:szCs w:val="20"/>
         </w:rPr>
-        <w:t>Macamo</w:t>
+        <w:t>Farassi</w:t>
       </w:r>
       <w:proofErr w:type="spellEnd"/>
       <w:r>
@@ -5469,7 +5329,7 @@
           <w:sz w:val="20"/>
           <w:szCs w:val="20"/>
         </w:rPr>
-        <w:t xml:space="preserve"> S, Bamford M, Martinez FI, </w:t>
+        <w:t xml:space="preserve"> R, </w:t>
       </w:r>
       <w:proofErr w:type="spellStart"/>
       <w:r>
@@ -5478,7 +5338,7 @@
           <w:sz w:val="20"/>
           <w:szCs w:val="20"/>
         </w:rPr>
-        <w:t>Püschel</w:t>
+        <w:t>Lüdecke</w:t>
       </w:r>
       <w:proofErr w:type="spellEnd"/>
       <w:r>
@@ -5487,7 +5347,39 @@
           <w:sz w:val="20"/>
           <w:szCs w:val="20"/>
         </w:rPr>
-        <w:t xml:space="preserve"> TA, Capelli C, da Silva MJF, Anemone RL, Carvalho S. 2024. Caves of </w:t>
+        <w:t xml:space="preserve"> T, Martinez F, Mathe J, Ferreira da Silva MJ, Carvalho S. 2025. West </w:t>
+      </w:r>
+      <w:r>
+        <w:rPr>
+          <w:rFonts w:cstheme="minorHAnsi"/>
+          <w:sz w:val="20"/>
+          <w:szCs w:val="20"/>
+        </w:rPr>
+        <w:t>S</w:t>
+      </w:r>
+      <w:r>
+        <w:rPr>
+          <w:rFonts w:cstheme="minorHAnsi"/>
+          <w:sz w:val="20"/>
+          <w:szCs w:val="20"/>
+        </w:rPr>
+        <w:t xml:space="preserve">ide </w:t>
+      </w:r>
+      <w:r>
+        <w:rPr>
+          <w:rFonts w:cstheme="minorHAnsi"/>
+          <w:sz w:val="20"/>
+          <w:szCs w:val="20"/>
+        </w:rPr>
+        <w:t>S</w:t>
+      </w:r>
+      <w:r>
+        <w:rPr>
+          <w:rFonts w:cstheme="minorHAnsi"/>
+          <w:sz w:val="20"/>
+          <w:szCs w:val="20"/>
+        </w:rPr>
+        <w:t xml:space="preserve">tory: Regional inter-troop variation in baboon bark-stripping at </w:t>
       </w:r>
       <w:proofErr w:type="spellStart"/>
       <w:r>
@@ -5496,7 +5388,15 @@
           <w:sz w:val="20"/>
           <w:szCs w:val="20"/>
         </w:rPr>
-        <w:t>Inhaminga</w:t>
+        <w:t>G</w:t>
+      </w:r>
+      <w:r>
+        <w:rPr>
+          <w:rFonts w:cstheme="minorHAnsi"/>
+          <w:sz w:val="20"/>
+          <w:szCs w:val="20"/>
+        </w:rPr>
+        <w:t>orongosa</w:t>
       </w:r>
       <w:proofErr w:type="spellEnd"/>
       <w:r>
@@ -5505,25 +5405,55 @@
           <w:sz w:val="20"/>
           <w:szCs w:val="20"/>
         </w:rPr>
-        <w:t xml:space="preserve">: the speleological heritage of the </w:t>
-      </w:r>
-      <w:proofErr w:type="spellStart"/>
-      <w:r>
-        <w:rPr>
-          <w:rFonts w:cstheme="minorHAnsi"/>
-          <w:sz w:val="20"/>
-          <w:szCs w:val="20"/>
-        </w:rPr>
-        <w:t>Cheringoma</w:t>
-      </w:r>
-      <w:proofErr w:type="spellEnd"/>
-      <w:r>
-        <w:rPr>
-          <w:rFonts w:cstheme="minorHAnsi"/>
-          <w:sz w:val="20"/>
-          <w:szCs w:val="20"/>
-        </w:rPr>
-        <w:t xml:space="preserve"> Plateau, Mozambique. </w:t>
+        <w:t xml:space="preserve"> </w:t>
+      </w:r>
+      <w:r>
+        <w:rPr>
+          <w:rFonts w:cstheme="minorHAnsi"/>
+          <w:sz w:val="20"/>
+          <w:szCs w:val="20"/>
+        </w:rPr>
+        <w:t>N</w:t>
+      </w:r>
+      <w:r>
+        <w:rPr>
+          <w:rFonts w:cstheme="minorHAnsi"/>
+          <w:sz w:val="20"/>
+          <w:szCs w:val="20"/>
+        </w:rPr>
+        <w:t xml:space="preserve">ational </w:t>
+      </w:r>
+      <w:r>
+        <w:rPr>
+          <w:rFonts w:cstheme="minorHAnsi"/>
+          <w:sz w:val="20"/>
+          <w:szCs w:val="20"/>
+        </w:rPr>
+        <w:t>P</w:t>
+      </w:r>
+      <w:r>
+        <w:rPr>
+          <w:rFonts w:cstheme="minorHAnsi"/>
+          <w:sz w:val="20"/>
+          <w:szCs w:val="20"/>
+        </w:rPr>
+        <w:t xml:space="preserve">ark, </w:t>
+      </w:r>
+      <w:r>
+        <w:rPr>
+          <w:rFonts w:cstheme="minorHAnsi"/>
+          <w:sz w:val="20"/>
+          <w:szCs w:val="20"/>
+        </w:rPr>
+        <w:t>M</w:t>
+      </w:r>
+      <w:r>
+        <w:rPr>
+          <w:rFonts w:cstheme="minorHAnsi"/>
+          <w:sz w:val="20"/>
+          <w:szCs w:val="20"/>
+        </w:rPr>
+        <w:t xml:space="preserve">ozambique. </w:t>
       </w:r>
       <w:r>
         <w:rPr>
@@ -5533,15 +5463,49 @@
           <w:sz w:val="20"/>
           <w:szCs w:val="20"/>
         </w:rPr>
-        <w:t>Cave and Karst Science</w:t>
-      </w:r>
-      <w:r>
-        <w:rPr>
-          <w:rFonts w:cstheme="minorHAnsi"/>
-          <w:sz w:val="20"/>
-          <w:szCs w:val="20"/>
-        </w:rPr>
-        <w:t xml:space="preserve"> 51:67–80.</w:t>
+        <w:t>American Journal of Biological Anthropology</w:t>
+      </w:r>
+      <w:r>
+        <w:rPr>
+          <w:rFonts w:cstheme="minorHAnsi"/>
+          <w:sz w:val="20"/>
+          <w:szCs w:val="20"/>
+        </w:rPr>
+        <w:t xml:space="preserve">, </w:t>
+      </w:r>
+      <w:proofErr w:type="gramStart"/>
+      <w:r>
+        <w:rPr>
+          <w:rFonts w:cstheme="minorHAnsi"/>
+          <w:sz w:val="20"/>
+          <w:szCs w:val="20"/>
+        </w:rPr>
+        <w:t>187:e</w:t>
+      </w:r>
+      <w:proofErr w:type="gramEnd"/>
+      <w:r>
+        <w:rPr>
+          <w:rFonts w:cstheme="minorHAnsi"/>
+          <w:sz w:val="20"/>
+          <w:szCs w:val="20"/>
+        </w:rPr>
+        <w:t xml:space="preserve">70057. </w:t>
+      </w:r>
+      <w:r>
+        <w:rPr>
+          <w:rFonts w:cstheme="minorHAnsi"/>
+          <w:sz w:val="20"/>
+          <w:szCs w:val="20"/>
+        </w:rPr>
+        <w:t xml:space="preserve">DOI: </w:t>
+      </w:r>
+      <w:r>
+        <w:rPr>
+          <w:rFonts w:cstheme="minorHAnsi"/>
+          <w:sz w:val="20"/>
+          <w:szCs w:val="20"/>
+        </w:rPr>
+        <w:t>10.1002/ajpa.70057</w:t>
       </w:r>
     </w:p>
     <w:p>
@@ -5561,23 +5525,25 @@
           <w:sz w:val="20"/>
           <w:szCs w:val="20"/>
         </w:rPr>
-        <w:t xml:space="preserve">Freymann </w:t>
-      </w:r>
-      <w:r>
-        <w:rPr>
-          <w:rFonts w:cstheme="minorHAnsi"/>
-          <w:sz w:val="20"/>
-          <w:szCs w:val="20"/>
-        </w:rPr>
-        <w:t>E</w:t>
-      </w:r>
-      <w:r>
-        <w:rPr>
-          <w:rFonts w:cstheme="minorHAnsi"/>
-          <w:sz w:val="20"/>
-          <w:szCs w:val="20"/>
-        </w:rPr>
-        <w:t xml:space="preserve">, </w:t>
+        <w:t xml:space="preserve">Regala FT, Pinto MJ, Paulo LM, Bobe R, Raja M, Aldeias V, Archer W, Braun DR, </w:t>
+      </w:r>
+      <w:proofErr w:type="spellStart"/>
+      <w:r>
+        <w:rPr>
+          <w:rFonts w:cstheme="minorHAnsi"/>
+          <w:sz w:val="20"/>
+          <w:szCs w:val="20"/>
+        </w:rPr>
+        <w:t>Lüdecke</w:t>
+      </w:r>
+      <w:proofErr w:type="spellEnd"/>
+      <w:r>
+        <w:rPr>
+          <w:rFonts w:cstheme="minorHAnsi"/>
+          <w:sz w:val="20"/>
+          <w:szCs w:val="20"/>
+        </w:rPr>
+        <w:t xml:space="preserve"> T, </w:t>
       </w:r>
       <w:r>
         <w:rPr>
@@ -5595,55 +5561,7 @@
           <w:sz w:val="20"/>
           <w:szCs w:val="20"/>
         </w:rPr>
-        <w:t xml:space="preserve">, Muhumuza </w:t>
-      </w:r>
-      <w:r>
-        <w:rPr>
-          <w:rFonts w:cstheme="minorHAnsi"/>
-          <w:sz w:val="20"/>
-          <w:szCs w:val="20"/>
-        </w:rPr>
-        <w:t>G</w:t>
-      </w:r>
-      <w:r>
-        <w:rPr>
-          <w:rFonts w:cstheme="minorHAnsi"/>
-          <w:sz w:val="20"/>
-          <w:szCs w:val="20"/>
-        </w:rPr>
-        <w:t xml:space="preserve">, Hobaiter </w:t>
-      </w:r>
-      <w:r>
-        <w:rPr>
-          <w:rFonts w:cstheme="minorHAnsi"/>
-          <w:sz w:val="20"/>
-          <w:szCs w:val="20"/>
-        </w:rPr>
-        <w:t>C</w:t>
-      </w:r>
-      <w:r>
-        <w:rPr>
-          <w:rFonts w:cstheme="minorHAnsi"/>
-          <w:sz w:val="20"/>
-          <w:szCs w:val="20"/>
-        </w:rPr>
-        <w:t xml:space="preserve">, Huffman </w:t>
-      </w:r>
-      <w:r>
-        <w:rPr>
-          <w:rFonts w:cstheme="minorHAnsi"/>
-          <w:sz w:val="20"/>
-          <w:szCs w:val="20"/>
-        </w:rPr>
-        <w:t>MA</w:t>
-      </w:r>
-      <w:r>
-        <w:rPr>
-          <w:rFonts w:cstheme="minorHAnsi"/>
-          <w:sz w:val="20"/>
-          <w:szCs w:val="20"/>
-        </w:rPr>
-        <w:t xml:space="preserve">, </w:t>
+        <w:t xml:space="preserve">, Mathe J, </w:t>
       </w:r>
       <w:proofErr w:type="spellStart"/>
       <w:r>
@@ -5652,7 +5570,7 @@
           <w:sz w:val="20"/>
           <w:szCs w:val="20"/>
         </w:rPr>
-        <w:t>Zuberbühler</w:t>
+        <w:t>Macamo</w:t>
       </w:r>
       <w:proofErr w:type="spellEnd"/>
       <w:r>
@@ -5661,63 +5579,61 @@
           <w:sz w:val="20"/>
           <w:szCs w:val="20"/>
         </w:rPr>
-        <w:t xml:space="preserve"> K</w:t>
-      </w:r>
-      <w:r>
-        <w:rPr>
-          <w:rFonts w:cstheme="minorHAnsi"/>
-          <w:sz w:val="20"/>
-          <w:szCs w:val="20"/>
-        </w:rPr>
-        <w:t>, Carvalho</w:t>
-      </w:r>
-      <w:r>
-        <w:rPr>
-          <w:rFonts w:cstheme="minorHAnsi"/>
-          <w:sz w:val="20"/>
-          <w:szCs w:val="20"/>
-        </w:rPr>
-        <w:t xml:space="preserve"> S. 202</w:t>
-      </w:r>
-      <w:r>
-        <w:rPr>
-          <w:rFonts w:cstheme="minorHAnsi"/>
-          <w:sz w:val="20"/>
-          <w:szCs w:val="20"/>
-        </w:rPr>
-        <w:t>4</w:t>
-      </w:r>
-      <w:r>
-        <w:rPr>
-          <w:rFonts w:cstheme="minorHAnsi"/>
-          <w:sz w:val="20"/>
-          <w:szCs w:val="20"/>
-        </w:rPr>
-        <w:t>.</w:t>
-      </w:r>
-      <w:r>
-        <w:rPr>
-          <w:rFonts w:cstheme="minorHAnsi"/>
-          <w:sz w:val="20"/>
-          <w:szCs w:val="20"/>
-        </w:rPr>
-        <w:t xml:space="preserve"> </w:t>
-      </w:r>
-      <w:r>
-        <w:rPr>
-          <w:rFonts w:cstheme="minorHAnsi"/>
-          <w:sz w:val="20"/>
-          <w:szCs w:val="20"/>
-        </w:rPr>
-        <w:t>Applying Collocation and APRIORI Analyses to Chimpanzee Diets: methods for investigating non-random food combinations in primate self-medication</w:t>
-      </w:r>
-      <w:r>
-        <w:rPr>
-          <w:rFonts w:cstheme="minorHAnsi"/>
-          <w:sz w:val="20"/>
-          <w:szCs w:val="20"/>
-        </w:rPr>
-        <w:t xml:space="preserve">. </w:t>
+        <w:t xml:space="preserve"> S, Bamford M, Martinez FI, </w:t>
+      </w:r>
+      <w:proofErr w:type="spellStart"/>
+      <w:r>
+        <w:rPr>
+          <w:rFonts w:cstheme="minorHAnsi"/>
+          <w:sz w:val="20"/>
+          <w:szCs w:val="20"/>
+        </w:rPr>
+        <w:t>Püschel</w:t>
+      </w:r>
+      <w:proofErr w:type="spellEnd"/>
+      <w:r>
+        <w:rPr>
+          <w:rFonts w:cstheme="minorHAnsi"/>
+          <w:sz w:val="20"/>
+          <w:szCs w:val="20"/>
+        </w:rPr>
+        <w:t xml:space="preserve"> TA, Capelli C, da Silva MJF, Anemone RL, Carvalho S. 2024. Caves of </w:t>
+      </w:r>
+      <w:proofErr w:type="spellStart"/>
+      <w:r>
+        <w:rPr>
+          <w:rFonts w:cstheme="minorHAnsi"/>
+          <w:sz w:val="20"/>
+          <w:szCs w:val="20"/>
+        </w:rPr>
+        <w:t>Inhaminga</w:t>
+      </w:r>
+      <w:proofErr w:type="spellEnd"/>
+      <w:r>
+        <w:rPr>
+          <w:rFonts w:cstheme="minorHAnsi"/>
+          <w:sz w:val="20"/>
+          <w:szCs w:val="20"/>
+        </w:rPr>
+        <w:t xml:space="preserve">: the speleological heritage of the </w:t>
+      </w:r>
+      <w:proofErr w:type="spellStart"/>
+      <w:r>
+        <w:rPr>
+          <w:rFonts w:cstheme="minorHAnsi"/>
+          <w:sz w:val="20"/>
+          <w:szCs w:val="20"/>
+        </w:rPr>
+        <w:t>Cheringoma</w:t>
+      </w:r>
+      <w:proofErr w:type="spellEnd"/>
+      <w:r>
+        <w:rPr>
+          <w:rFonts w:cstheme="minorHAnsi"/>
+          <w:sz w:val="20"/>
+          <w:szCs w:val="20"/>
+        </w:rPr>
+        <w:t xml:space="preserve"> Plateau, Mozambique. </w:t>
       </w:r>
       <w:r>
         <w:rPr>
@@ -5727,31 +5643,25 @@
           <w:sz w:val="20"/>
           <w:szCs w:val="20"/>
         </w:rPr>
-        <w:t>American Journal of Primatology</w:t>
-      </w:r>
-      <w:r>
-        <w:rPr>
-          <w:rFonts w:cstheme="minorHAnsi"/>
-          <w:sz w:val="20"/>
-          <w:szCs w:val="20"/>
-        </w:rPr>
-        <w:t>.</w:t>
-      </w:r>
-      <w:r>
-        <w:rPr>
-          <w:rFonts w:cstheme="minorHAnsi"/>
-          <w:sz w:val="20"/>
-          <w:szCs w:val="20"/>
-        </w:rPr>
-        <w:t xml:space="preserve"> </w:t>
-      </w:r>
-      <w:r>
-        <w:rPr>
-          <w:rFonts w:cstheme="minorHAnsi"/>
-          <w:sz w:val="20"/>
-          <w:szCs w:val="20"/>
-        </w:rPr>
-        <w:t>e23603 10.1002/ajp.23603</w:t>
+        <w:t>Cave and Karst Science</w:t>
+      </w:r>
+      <w:r>
+        <w:rPr>
+          <w:rFonts w:cstheme="minorHAnsi"/>
+          <w:i/>
+          <w:iCs/>
+          <w:sz w:val="20"/>
+          <w:szCs w:val="20"/>
+        </w:rPr>
+        <w:t>,</w:t>
+      </w:r>
+      <w:r>
+        <w:rPr>
+          <w:rFonts w:cstheme="minorHAnsi"/>
+          <w:sz w:val="20"/>
+          <w:szCs w:val="20"/>
+        </w:rPr>
+        <w:t xml:space="preserve"> 51:67–80.</w:t>
       </w:r>
     </w:p>
     <w:p>
@@ -5761,20 +5671,354 @@
         <w:jc w:val="both"/>
         <w:rPr>
           <w:rFonts w:cstheme="minorHAnsi"/>
+          <w:sz w:val="20"/>
+          <w:szCs w:val="20"/>
+        </w:rPr>
+      </w:pPr>
+      <w:r>
+        <w:rPr>
+          <w:rFonts w:cstheme="minorHAnsi"/>
+          <w:sz w:val="20"/>
+          <w:szCs w:val="20"/>
+        </w:rPr>
+        <w:lastRenderedPageBreak/>
+        <w:t xml:space="preserve">Scott GR, </w:t>
+      </w:r>
+      <w:proofErr w:type="spellStart"/>
+      <w:r>
+        <w:rPr>
+          <w:rFonts w:cstheme="minorHAnsi"/>
+          <w:sz w:val="20"/>
+          <w:szCs w:val="20"/>
+        </w:rPr>
+        <w:t>Navega</w:t>
+      </w:r>
+      <w:proofErr w:type="spellEnd"/>
+      <w:r>
+        <w:rPr>
+          <w:rFonts w:cstheme="minorHAnsi"/>
+          <w:sz w:val="20"/>
+          <w:szCs w:val="20"/>
+        </w:rPr>
+        <w:t xml:space="preserve"> DS, </w:t>
+      </w:r>
+      <w:r>
+        <w:rPr>
+          <w:rFonts w:cstheme="minorHAnsi"/>
+          <w:b/>
           <w:bCs/>
           <w:sz w:val="20"/>
           <w:szCs w:val="20"/>
-          <w:lang w:val="pt-PT"/>
-        </w:rPr>
-      </w:pPr>
-      <w:r>
-        <w:rPr>
-          <w:rFonts w:cstheme="minorHAnsi"/>
+        </w:rPr>
+        <w:t>d’Oliveira Coelho J</w:t>
+      </w:r>
+      <w:r>
+        <w:rPr>
+          <w:rFonts w:cstheme="minorHAnsi"/>
+          <w:sz w:val="20"/>
+          <w:szCs w:val="20"/>
+        </w:rPr>
+        <w:t xml:space="preserve">, </w:t>
+      </w:r>
+      <w:proofErr w:type="spellStart"/>
+      <w:r>
+        <w:rPr>
+          <w:rFonts w:cstheme="minorHAnsi"/>
+          <w:sz w:val="20"/>
+          <w:szCs w:val="20"/>
+        </w:rPr>
+        <w:t>Vlemincq</w:t>
+      </w:r>
+      <w:proofErr w:type="spellEnd"/>
+      <w:r>
+        <w:rPr>
+          <w:rFonts w:cstheme="minorHAnsi"/>
+          <w:sz w:val="20"/>
+          <w:szCs w:val="20"/>
+        </w:rPr>
+        <w:t>-Mendieta T, Kenessey D, Irish JD. 2024. rASUDAS2: A new iteration of the application for assessing the population affinity of individuals by tooth crown and root morphology. </w:t>
+      </w:r>
+      <w:r>
+        <w:rPr>
+          <w:rFonts w:cstheme="minorHAnsi"/>
+          <w:i/>
+          <w:iCs/>
+          <w:sz w:val="20"/>
+          <w:szCs w:val="20"/>
+        </w:rPr>
+        <w:t>Forensic Anthropology</w:t>
+      </w:r>
+      <w:r>
+        <w:rPr>
+          <w:rFonts w:cstheme="minorHAnsi"/>
+          <w:sz w:val="20"/>
+          <w:szCs w:val="20"/>
+        </w:rPr>
+        <w:t>, 8(1</w:t>
+      </w:r>
+      <w:r>
+        <w:rPr>
+          <w:rFonts w:cstheme="minorHAnsi"/>
+          <w:sz w:val="20"/>
+          <w:szCs w:val="20"/>
+        </w:rPr>
+        <w:t>):</w:t>
+      </w:r>
+      <w:r>
+        <w:rPr>
+          <w:rFonts w:cstheme="minorHAnsi"/>
+          <w:sz w:val="20"/>
+          <w:szCs w:val="20"/>
+        </w:rPr>
+        <w:t>1–9</w:t>
+      </w:r>
+      <w:r>
+        <w:rPr>
+          <w:rFonts w:cstheme="minorHAnsi"/>
+          <w:sz w:val="20"/>
+          <w:szCs w:val="20"/>
+        </w:rPr>
+        <w:t xml:space="preserve">. DOI: </w:t>
+      </w:r>
+      <w:r>
+        <w:rPr>
+          <w:rFonts w:cstheme="minorHAnsi"/>
+          <w:sz w:val="20"/>
+          <w:szCs w:val="20"/>
+        </w:rPr>
+        <w:t>10.5744/fa.2024.0006</w:t>
+      </w:r>
+    </w:p>
+    <w:p>
+      <w:pPr>
+        <w:spacing w:after="0" w:line="240" w:lineRule="auto"/>
+        <w:ind w:left="284" w:hanging="284"/>
+        <w:jc w:val="both"/>
+        <w:rPr>
+          <w:rFonts w:cstheme="minorHAnsi"/>
+          <w:sz w:val="20"/>
+          <w:szCs w:val="20"/>
+        </w:rPr>
+      </w:pPr>
+      <w:r>
+        <w:rPr>
+          <w:rFonts w:cstheme="minorHAnsi"/>
+          <w:sz w:val="20"/>
+          <w:szCs w:val="20"/>
+        </w:rPr>
+        <w:t xml:space="preserve">Freymann </w:t>
+      </w:r>
+      <w:r>
+        <w:rPr>
+          <w:rFonts w:cstheme="minorHAnsi"/>
+          <w:sz w:val="20"/>
+          <w:szCs w:val="20"/>
+        </w:rPr>
+        <w:t>E</w:t>
+      </w:r>
+      <w:r>
+        <w:rPr>
+          <w:rFonts w:cstheme="minorHAnsi"/>
+          <w:sz w:val="20"/>
+          <w:szCs w:val="20"/>
+        </w:rPr>
+        <w:t xml:space="preserve">, </w:t>
+      </w:r>
+      <w:r>
+        <w:rPr>
+          <w:rFonts w:cstheme="minorHAnsi"/>
+          <w:b/>
           <w:bCs/>
           <w:sz w:val="20"/>
           <w:szCs w:val="20"/>
         </w:rPr>
-        <w:lastRenderedPageBreak/>
+        <w:t>d’Oliveira Coelho J</w:t>
+      </w:r>
+      <w:r>
+        <w:rPr>
+          <w:rFonts w:cstheme="minorHAnsi"/>
+          <w:sz w:val="20"/>
+          <w:szCs w:val="20"/>
+        </w:rPr>
+        <w:t xml:space="preserve">, Muhumuza </w:t>
+      </w:r>
+      <w:r>
+        <w:rPr>
+          <w:rFonts w:cstheme="minorHAnsi"/>
+          <w:sz w:val="20"/>
+          <w:szCs w:val="20"/>
+        </w:rPr>
+        <w:t>G</w:t>
+      </w:r>
+      <w:r>
+        <w:rPr>
+          <w:rFonts w:cstheme="minorHAnsi"/>
+          <w:sz w:val="20"/>
+          <w:szCs w:val="20"/>
+        </w:rPr>
+        <w:t xml:space="preserve">, Hobaiter </w:t>
+      </w:r>
+      <w:r>
+        <w:rPr>
+          <w:rFonts w:cstheme="minorHAnsi"/>
+          <w:sz w:val="20"/>
+          <w:szCs w:val="20"/>
+        </w:rPr>
+        <w:t>C</w:t>
+      </w:r>
+      <w:r>
+        <w:rPr>
+          <w:rFonts w:cstheme="minorHAnsi"/>
+          <w:sz w:val="20"/>
+          <w:szCs w:val="20"/>
+        </w:rPr>
+        <w:t xml:space="preserve">, Huffman </w:t>
+      </w:r>
+      <w:r>
+        <w:rPr>
+          <w:rFonts w:cstheme="minorHAnsi"/>
+          <w:sz w:val="20"/>
+          <w:szCs w:val="20"/>
+        </w:rPr>
+        <w:t>MA</w:t>
+      </w:r>
+      <w:r>
+        <w:rPr>
+          <w:rFonts w:cstheme="minorHAnsi"/>
+          <w:sz w:val="20"/>
+          <w:szCs w:val="20"/>
+        </w:rPr>
+        <w:t xml:space="preserve">, </w:t>
+      </w:r>
+      <w:proofErr w:type="spellStart"/>
+      <w:r>
+        <w:rPr>
+          <w:rFonts w:cstheme="minorHAnsi"/>
+          <w:sz w:val="20"/>
+          <w:szCs w:val="20"/>
+        </w:rPr>
+        <w:t>Zuberbühler</w:t>
+      </w:r>
+      <w:proofErr w:type="spellEnd"/>
+      <w:r>
+        <w:rPr>
+          <w:rFonts w:cstheme="minorHAnsi"/>
+          <w:sz w:val="20"/>
+          <w:szCs w:val="20"/>
+        </w:rPr>
+        <w:t xml:space="preserve"> K</w:t>
+      </w:r>
+      <w:r>
+        <w:rPr>
+          <w:rFonts w:cstheme="minorHAnsi"/>
+          <w:sz w:val="20"/>
+          <w:szCs w:val="20"/>
+        </w:rPr>
+        <w:t>, Carvalho</w:t>
+      </w:r>
+      <w:r>
+        <w:rPr>
+          <w:rFonts w:cstheme="minorHAnsi"/>
+          <w:sz w:val="20"/>
+          <w:szCs w:val="20"/>
+        </w:rPr>
+        <w:t xml:space="preserve"> S. 202</w:t>
+      </w:r>
+      <w:r>
+        <w:rPr>
+          <w:rFonts w:cstheme="minorHAnsi"/>
+          <w:sz w:val="20"/>
+          <w:szCs w:val="20"/>
+        </w:rPr>
+        <w:t>4</w:t>
+      </w:r>
+      <w:r>
+        <w:rPr>
+          <w:rFonts w:cstheme="minorHAnsi"/>
+          <w:sz w:val="20"/>
+          <w:szCs w:val="20"/>
+        </w:rPr>
+        <w:t>.</w:t>
+      </w:r>
+      <w:r>
+        <w:rPr>
+          <w:rFonts w:cstheme="minorHAnsi"/>
+          <w:sz w:val="20"/>
+          <w:szCs w:val="20"/>
+        </w:rPr>
+        <w:t xml:space="preserve"> </w:t>
+      </w:r>
+      <w:r>
+        <w:rPr>
+          <w:rFonts w:cstheme="minorHAnsi"/>
+          <w:sz w:val="20"/>
+          <w:szCs w:val="20"/>
+        </w:rPr>
+        <w:t>Applying Collocation and APRIORI Analyses to Chimpanzee Diets: methods for investigating non-random food combinations in primate self-medication</w:t>
+      </w:r>
+      <w:r>
+        <w:rPr>
+          <w:rFonts w:cstheme="minorHAnsi"/>
+          <w:sz w:val="20"/>
+          <w:szCs w:val="20"/>
+        </w:rPr>
+        <w:t xml:space="preserve">. </w:t>
+      </w:r>
+      <w:r>
+        <w:rPr>
+          <w:rFonts w:cstheme="minorHAnsi"/>
+          <w:i/>
+          <w:iCs/>
+          <w:sz w:val="20"/>
+          <w:szCs w:val="20"/>
+        </w:rPr>
+        <w:t>American Journal of Primatology</w:t>
+      </w:r>
+      <w:r>
+        <w:rPr>
+          <w:rFonts w:cstheme="minorHAnsi"/>
+          <w:sz w:val="20"/>
+          <w:szCs w:val="20"/>
+        </w:rPr>
+        <w:t>.</w:t>
+      </w:r>
+      <w:r>
+        <w:rPr>
+          <w:rFonts w:cstheme="minorHAnsi"/>
+          <w:sz w:val="20"/>
+          <w:szCs w:val="20"/>
+        </w:rPr>
+        <w:t xml:space="preserve"> </w:t>
+      </w:r>
+      <w:r>
+        <w:rPr>
+          <w:rFonts w:cstheme="minorHAnsi"/>
+          <w:sz w:val="20"/>
+          <w:szCs w:val="20"/>
+        </w:rPr>
+        <w:t>e23603 10.1002/ajp.23603</w:t>
+      </w:r>
+    </w:p>
+    <w:p>
+      <w:pPr>
+        <w:spacing w:after="0" w:line="240" w:lineRule="auto"/>
+        <w:ind w:left="284" w:hanging="284"/>
+        <w:jc w:val="both"/>
+        <w:rPr>
+          <w:rFonts w:cstheme="minorHAnsi"/>
+          <w:bCs/>
+          <w:sz w:val="20"/>
+          <w:szCs w:val="20"/>
+          <w:lang w:val="pt-PT"/>
+        </w:rPr>
+      </w:pPr>
+      <w:r>
+        <w:rPr>
+          <w:rFonts w:cstheme="minorHAnsi"/>
+          <w:bCs/>
+          <w:sz w:val="20"/>
+          <w:szCs w:val="20"/>
+        </w:rPr>
         <w:t>Bobe</w:t>
       </w:r>
       <w:r>
@@ -6373,25 +6617,7 @@
           <w:sz w:val="20"/>
           <w:szCs w:val="20"/>
         </w:rPr>
-        <w:t xml:space="preserve">Early Hominins and Paleoecology of the </w:t>
-      </w:r>
-      <w:proofErr w:type="spellStart"/>
-      <w:r>
-        <w:rPr>
-          <w:rFonts w:cstheme="minorHAnsi"/>
-          <w:sz w:val="20"/>
-          <w:szCs w:val="20"/>
-        </w:rPr>
-        <w:t>Koobi</w:t>
-      </w:r>
-      <w:proofErr w:type="spellEnd"/>
-      <w:r>
-        <w:rPr>
-          <w:rFonts w:cstheme="minorHAnsi"/>
-          <w:sz w:val="20"/>
-          <w:szCs w:val="20"/>
-        </w:rPr>
-        <w:t xml:space="preserve"> Fora Formation, Lake Turkana Basin, Kenya</w:t>
+        <w:t>Early Hominins and Paleoecology of the Koobi Fora Formation, Lake Turkana Basin, Kenya</w:t>
       </w:r>
       <w:r>
         <w:rPr>
@@ -8596,6 +8822,7 @@
           <w:sz w:val="20"/>
           <w:szCs w:val="20"/>
         </w:rPr>
+        <w:lastRenderedPageBreak/>
         <w:t xml:space="preserve">Scott GR, </w:t>
       </w:r>
       <w:proofErr w:type="spellStart"/>
@@ -8802,25 +9029,7 @@
           <w:sz w:val="20"/>
           <w:szCs w:val="20"/>
         </w:rPr>
-        <w:t xml:space="preserve">Using remote sensing and machine learning to reconstruct paleoenvironmental features in the </w:t>
-      </w:r>
-      <w:proofErr w:type="spellStart"/>
-      <w:r>
-        <w:rPr>
-          <w:rFonts w:eastAsia="Calibri" w:cstheme="minorHAnsi"/>
-          <w:sz w:val="20"/>
-          <w:szCs w:val="20"/>
-        </w:rPr>
-        <w:t>Koobi</w:t>
-      </w:r>
-      <w:proofErr w:type="spellEnd"/>
-      <w:r>
-        <w:rPr>
-          <w:rFonts w:eastAsia="Calibri" w:cstheme="minorHAnsi"/>
-          <w:sz w:val="20"/>
-          <w:szCs w:val="20"/>
-        </w:rPr>
-        <w:t xml:space="preserve"> Fora Formation. </w:t>
+        <w:t xml:space="preserve">Using remote sensing and machine learning to reconstruct paleoenvironmental features in the Koobi Fora Formation. </w:t>
       </w:r>
       <w:r>
         <w:rPr>
@@ -8868,7 +9077,6 @@
           <w:sz w:val="20"/>
           <w:szCs w:val="20"/>
         </w:rPr>
-        <w:lastRenderedPageBreak/>
         <w:t>d’Oliveira Coelho J</w:t>
       </w:r>
       <w:r>
@@ -11237,25 +11445,7 @@
           <w:sz w:val="20"/>
           <w:szCs w:val="20"/>
         </w:rPr>
-        <w:t xml:space="preserve">Using remote sensing and machine learning to reconstruct paleoenvironmental features in the </w:t>
-      </w:r>
-      <w:proofErr w:type="spellStart"/>
-      <w:r>
-        <w:rPr>
-          <w:rFonts w:eastAsia="Calibri" w:cstheme="minorHAnsi"/>
-          <w:sz w:val="20"/>
-          <w:szCs w:val="20"/>
-        </w:rPr>
-        <w:t>Koobi</w:t>
-      </w:r>
-      <w:proofErr w:type="spellEnd"/>
-      <w:r>
-        <w:rPr>
-          <w:rFonts w:eastAsia="Calibri" w:cstheme="minorHAnsi"/>
-          <w:sz w:val="20"/>
-          <w:szCs w:val="20"/>
-        </w:rPr>
-        <w:t xml:space="preserve"> Fora Formation. </w:t>
+        <w:t xml:space="preserve">Using remote sensing and machine learning to reconstruct paleoenvironmental features in the Koobi Fora Formation. </w:t>
       </w:r>
       <w:r>
         <w:rPr>
@@ -11461,6 +11651,7 @@
           <w:sz w:val="20"/>
           <w:szCs w:val="20"/>
         </w:rPr>
+        <w:lastRenderedPageBreak/>
         <w:t>d’Oliveira Coelho J</w:t>
       </w:r>
       <w:r>
@@ -11757,7 +11948,6 @@
           <w:sz w:val="20"/>
           <w:szCs w:val="20"/>
         </w:rPr>
-        <w:lastRenderedPageBreak/>
         <w:t>d’Oliveira Coelho J</w:t>
       </w:r>
       <w:r>
@@ -11766,25 +11956,7 @@
           <w:sz w:val="20"/>
           <w:szCs w:val="20"/>
         </w:rPr>
-        <w:t xml:space="preserve">, Anemone RL, Bobe R, Carvalho S. Let the computers do the surveying: applying support vector machines on spectral data to identify new fossiliferous deposits in </w:t>
-      </w:r>
-      <w:proofErr w:type="spellStart"/>
-      <w:r>
-        <w:rPr>
-          <w:rFonts w:eastAsia="Calibri" w:cstheme="minorHAnsi"/>
-          <w:sz w:val="20"/>
-          <w:szCs w:val="20"/>
-        </w:rPr>
-        <w:t>Koobi</w:t>
-      </w:r>
-      <w:proofErr w:type="spellEnd"/>
-      <w:r>
-        <w:rPr>
-          <w:rFonts w:eastAsia="Calibri" w:cstheme="minorHAnsi"/>
-          <w:sz w:val="20"/>
-          <w:szCs w:val="20"/>
-        </w:rPr>
-        <w:t xml:space="preserve"> Fora, Kenya</w:t>
+        <w:t>, Anemone RL, Bobe R, Carvalho S. Let the computers do the surveying: applying support vector machines on spectral data to identify new fossiliferous deposits in Koobi Fora, Kenya</w:t>
       </w:r>
       <w:r>
         <w:rPr>
@@ -14841,6 +15013,7 @@
           <w:szCs w:val="20"/>
           <w:lang w:val="pt-PT"/>
         </w:rPr>
+        <w:lastRenderedPageBreak/>
         <w:t>d'Oliveira Coelho J</w:t>
       </w:r>
       <w:r>
@@ -15442,7 +15615,6 @@
           <w:szCs w:val="20"/>
           <w:lang w:val="pt-PT"/>
         </w:rPr>
-        <w:lastRenderedPageBreak/>
         <w:t>Curate</w:t>
       </w:r>
       <w:proofErr w:type="spellEnd"/>
@@ -17651,6 +17823,7 @@
           <w:sz w:val="20"/>
           <w:szCs w:val="20"/>
         </w:rPr>
+        <w:lastRenderedPageBreak/>
         <w:t>University of Wollongong:</w:t>
       </w:r>
       <w:r>

</xml_diff>